<commit_message>
Actualizar contrato Extravagance - pago semanal de 2,500, publicidad en medios digitales sin plataformas especificas, blindaje sobre cuentas/contenido, quitar camara de sesiones, obligacion del cliente para dias de grabacion
Co-Authored-By: Claude Fable 5 <noreply@anthropic.com>
Claude-Session: https://claude.ai/code/session_01UpK5k3qizhRGNuCxpEBySM
</commit_message>
<xml_diff>
--- a/extravagance/Contrato_MEDUSSSA_STUDIO_EXTRAVAGANCE_Paquete_10000.docx
+++ b/extravagance/Contrato_MEDUSSSA_STUDIO_EXTRAVAGANCE_Paquete_10000.docx
@@ -218,7 +218,7 @@
         <w:jc w:val="both"/>
       </w:pPr>
       <w:r>
-        <w:t>• Realización de dos (2) sesiones mensuales de producción de fotografía y video dentro del establecimiento, destinadas a generar material audiovisual relacionado, entre otros elementos, con botellas, privados, personal, coctelería y características del lugar. Las sesiones podrán realizarse con equipo profesional, incluyendo cámara, iluminación, micrófonos y dron, sujeto a las condiciones físicas, operativas, de seguridad y de autorización existentes en el establecimiento.</w:t>
+        <w:t>• Realización de dos (2) sesiones mensuales de producción de fotografía y video dentro del establecimiento, destinadas a generar material audiovisual relacionado, entre otros elementos, con botellas, privados, personal, coctelería y características del lugar. Las sesiones podrán realizarse con equipo profesional, incluyendo iluminación, micrófonos y dron, sujeto a las condiciones físicas, operativas, de seguridad y de autorización existentes en el establecimiento.</w:t>
       </w:r>
     </w:p>
     <w:p>
@@ -246,7 +246,7 @@
         <w:jc w:val="both"/>
       </w:pPr>
       <w:r>
-        <w:t>• Gestión y optimización de campañas publicitarias mediante Meta Ads, incluyendo configuración, segmentación, elaboración o adaptación de creatividades, monitoreo y optimización.</w:t>
+        <w:t>• Gestión y optimización de campañas de publicidad en medios digitales, incluyendo configuración, segmentación, elaboración o adaptación de creatividades, monitoreo y optimización.</w:t>
       </w:r>
     </w:p>
     <w:p>
@@ -317,7 +317,7 @@
         <w:jc w:val="both"/>
       </w:pPr>
       <w:r>
-        <w:t>• La inversión destinada a publicidad o pauta en Meta, Google u otras plataformas digitales. Dicha inversión será cubierta directamente por EL CLIENTE mediante los métodos de pago vinculados a sus respectivas cuentas publicitarias. Como referencia operativa, se considera conveniente una inversión aproximada de entre $2,000.00 y $5,000.00 (DOS MIL A CINCO MIL PESOS 00/100 M.N.) mensuales, sin que dicha cantidad constituya obligación, mínimo de inversión, garantía de resultados ni responsabilidad económica a cargo de EL PRESTADOR.</w:t>
+        <w:t>• La inversión destinada a publicidad o pauta en plataformas de medios digitales. Dicha inversión será cubierta directamente por EL CLIENTE mediante los métodos de pago vinculados a sus respectivas cuentas publicitarias. Como referencia operativa, se considera conveniente una inversión aproximada de entre $2,000.00 y $5,000.00 (DOS MIL A CINCO MIL PESOS 00/100 M.N.) mensuales, sin que dicha cantidad constituya obligación, mínimo de inversión, garantía de resultados ni responsabilidad económica a cargo de EL PRESTADOR.</w:t>
       </w:r>
     </w:p>
     <w:p>
@@ -381,10 +381,7 @@
         <w:jc w:val="both"/>
       </w:pPr>
       <w:r>
-        <w:t xml:space="preserve">Como contraprestación por los servicios objeto del presente contrato, EL CLIENTE pagará a EL PRESTADOR la cantidad mensual de $10,000.00 (DIEZ MIL PESOS 00/100 M.N.), más el Impuesto al Valor Agregado (IVA) que corresponda, en caso de que resulte aplicable conforme al régimen fiscal de EL PRESTADOR y se solicite el comprobante fiscal correspondiente</w:t>
-      </w:r>
-      <w:r>
-        <w:t>.</w:t>
+        <w:t xml:space="preserve">Como contraprestación por los servicios objeto del presente contrato, EL CLIENTE pagará a EL PRESTADOR la cantidad semanal de $2,500.00 (DOS MIL QUINIENTOS PESOS 00/100 M.N.), más el Impuesto al Valor Agregado (IVA) que corresponda, en caso de que resulte aplicable conforme al régimen fiscal de EL PRESTADOR y se solicite el comprobante fiscal correspondiente.</w:t>
       </w:r>
     </w:p>
     <w:p>
@@ -393,7 +390,7 @@
         <w:jc w:val="both"/>
       </w:pPr>
       <w:r>
-        <w:t>El pago será realizado por mensualidad adelantada, dentro de los primeros cinco (5) días naturales de cada periodo mensual, en efectivo o mediante retiro sin tarjeta, conforme a los mecanismos que EL PRESTADOR comunique por escrito a EL CLIENTE. En caso de que EL CLIENTE solicite comprobante fiscal (factura), el pago correspondiente se realizará mediante transferencia electrónica a la cuenta bancaria que EL PRESTADOR indique por escrito, adicionando el Impuesto al Valor Agregado (IVA) que resulte aplicable.</w:t>
+        <w:t>El pago será realizado por semana adelantada, el día [LUNES / VIERNES] de cada semana, en efectivo o mediante retiro sin tarjeta, conforme a los mecanismos que EL PRESTADOR comunique por escrito a EL CLIENTE. En caso de que EL CLIENTE solicite comprobante fiscal (factura), el pago correspondiente se realizará mediante transferencia electrónica a la cuenta bancaria que EL PRESTADOR indique por escrito, adicionando el Impuesto al Valor Agregado (IVA) que resulte aplicable.</w:t>
       </w:r>
     </w:p>
     <w:p>
@@ -402,7 +399,7 @@
         <w:jc w:val="both"/>
       </w:pPr>
       <w:r>
-        <w:t>La primera mensualidad deberá encontrarse íntegramente cubierta antes del inicio de los servicios.</w:t>
+        <w:t>El primer pago semanal deberá encontrarse íntegramente cubierto antes del inicio de los servicios.</w:t>
       </w:r>
     </w:p>
     <w:p>
@@ -429,7 +426,7 @@
         <w:jc w:val="both"/>
       </w:pPr>
       <w:r>
-        <w:t>Si transcurridos diez (10) días naturales posteriores a la fecha de vencimiento EL CLIENTE no hubiera cubierto la cantidad correspondiente, EL PRESTADOR podrá suspender total o parcialmente la prestación de los servicios, incluyendo publicaciones, administración, automatizaciones y campañas publicitarias, sin que dicha suspensión constituya incumplimiento contractual.</w:t>
+        <w:t>Si transcurridos cinco (5) días naturales posteriores a la fecha de vencimiento EL CLIENTE no hubiera cubierto la cantidad correspondiente, EL PRESTADOR podrá suspender total o parcialmente la prestación de los servicios, incluyendo publicaciones, administración, automatizaciones y campañas publicitarias, sin que dicha suspensión constituya incumplimiento contractual.</w:t>
       </w:r>
     </w:p>
     <w:p>
@@ -482,7 +479,7 @@
         <w:jc w:val="both"/>
       </w:pPr>
       <w:r>
-        <w:t>En caso de terminación anticipada imputable a EL CLIENTE durante el periodo forzoso de vigencia, EL CLIENTE deberá cubrir a EL PRESTADOR, en concepto de pena convencional, una cantidad equivalente a una mensualidad de servicios, sin perjuicio del pago de las cantidades que se encuentren efectivamente devengadas y pendientes de pago a la fecha de terminación.</w:t>
+        <w:t>En caso de terminación anticipada imputable a EL CLIENTE durante el periodo forzoso de vigencia, EL CLIENTE deberá cubrir a EL PRESTADOR, en concepto de pena convencional, una cantidad equivalente a cuatro (4) pagos semanales de servicios, sin perjuicio del pago de las cantidades que se encuentren efectivamente devengadas y pendientes de pago a la fecha de terminación.</w:t>
       </w:r>
     </w:p>
     <w:p>
@@ -492,7 +489,7 @@
       </w:pPr>
       <w:r>
         <w:lastRenderedPageBreak/>
-        <w:t>Las cantidades correspondientes a mensualidades ya pagadas no serán reembolsables cuando correspondan a servicios ya iniciados o a la reserva de capacidad operativa, creativa y administrativa de EL PRESTADOR.</w:t>
+        <w:t>Las cantidades ya pagadas no serán reembolsables cuando correspondan a servicios ya iniciados o a la reserva de capacidad operativa, creativa y administrativa de EL PRESTADOR.</w:t>
       </w:r>
     </w:p>
     <w:p>
@@ -545,6 +542,15 @@
         <w:jc w:val="both"/>
       </w:pPr>
       <w:r>
+        <w:t>• Tener disponibles y debidamente preparados, en las fechas programadas para las sesiones de producción, la totalidad de los espacios, productos, botellas, personal, insumos y demás elementos que EL PRESTADOR le haya solicitado por escrito con anticipación. La falta de preparación o disponibilidad de dichos elementos en la fecha programada será responsabilidad exclusiva de EL CLIENTE y no generará responsabilidad ni incumplimiento alguno a cargo de EL PRESTADOR; en tal supuesto, la sesión correspondiente podrá tenerse por efectivamente realizada para todos los efectos del presente contrato o, a criterio de EL PRESTADOR, reprogramarse conforme a su disponibilidad operativa, sin que ello genere descuento, compensación o reembolso alguno a favor de EL CLIENTE.</w:t>
+      </w:r>
+    </w:p>
+    <w:p>
+      <w:pPr>
+        <w:ind w:firstLine="425"/>
+        <w:jc w:val="both"/>
+      </w:pPr>
+      <w:r>
         <w:t>• Designar a una persona responsable de la comunicación con EL PRESTADOR y de la aprobación de contenido, quien deberá contar con facultades suficientes para emitir instrucciones y autorizaciones.</w:t>
       </w:r>
     </w:p>
@@ -742,7 +748,7 @@
       </w:pPr>
       <w:r>
         <w:lastRenderedPageBreak/>
-        <w:t>EL CLIENTE reconoce que Meta, Instagram, Facebook, Google, WhatsApp y demás plataformas digitales son terceros independientes de LAS PARTES y que sus políticas, algoritmos, sistemas de revisión, restricciones y decisiones pueden modificarse en cualquier momento.</w:t>
+        <w:t>EL CLIENTE reconoce que las plataformas digitales, redes sociales, servicios de mensajería y demás servicios tecnológicos de terceros utilizados para la prestación de los servicios son terceros independientes de LAS PARTES y que sus políticas, algoritmos, sistemas de revisión, restricciones y decisiones pueden modificarse en cualquier momento.</w:t>
       </w:r>
     </w:p>
     <w:p>
@@ -769,7 +775,7 @@
         <w:jc w:val="both"/>
       </w:pPr>
       <w:r>
-        <w:t>El rechazo de anuncios, disminución de alcance, restricciones, bloqueos, suspensiones o inhabilitaciones ocasionadas por decisiones de las plataformas, cambios de políticas, historial previo de las cuentas, conducta de EL CLIENTE o acciones de terceros no constituirá, por sí mismo, incumplimiento de EL PRESTADOR.</w:t>
+        <w:t>El rechazo de anuncios, la disminución de alcance, las restricciones, los bloqueos, las suspensiones, las inhabilitaciones, la eliminación total o parcial de cuentas o perfiles, así como la pérdida o el borrado total o parcial de contenido, publicaciones, historial, mensajes, seguidores o demás activos digitales, ocasionados por decisiones de las plataformas, cambios de políticas, historial previo de las cuentas, conducta de EL CLIENTE o acciones de terceros no constituirá, por sí mismo, incumplimiento de EL PRESTADOR.</w:t>
       </w:r>
     </w:p>
     <w:p>
@@ -778,7 +784,7 @@
         <w:jc w:val="both"/>
       </w:pPr>
       <w:r>
-        <w:t>EL PRESTADOR tampoco será responsable por pérdidas derivadas de interrupciones, fallas técnicas o modificaciones realizadas por las plataformas digitales.</w:t>
+        <w:t>EL PRESTADOR tampoco será responsable por pérdidas derivadas de interrupciones, fallas técnicas o modificaciones realizadas por las plataformas digitales. Asimismo, EL PRESTADOR no será responsable por la suspensión, restricción, bloqueo, inhabilitación o eliminación de cuentas, perfiles o activos digitales, ni por la pérdida, borrado o inaccesibilidad de contenido, publicaciones o información, cuando dichas circunstancias deriven de decisiones, fallas o políticas de las plataformas, de acciones u omisiones de EL CLIENTE o de terceros, de accesos no autorizados no imputables a EL PRESTADOR o de cualquier otra causa ajena a su control. En tales supuestos, EL PRESTADOR no estará obligado a garantizar la recuperación o restauración de las cuentas, el contenido o la información afectados, sin perjuicio de que procurará realizar las gestiones razonables que se encuentren a su alcance. La ocurrencia de dichas circunstancias no suspenderá ni extinguirá las obligaciones de pago de EL CLIENTE respecto de los servicios efectivamente prestados.</w:t>
       </w:r>
     </w:p>
     <w:p>

</xml_diff>

<commit_message>
Actualizar contenidos del paquete Extravagance - 7 plantillas reutilizables para historias, 2 videos y 3 carruseles mensuales
Co-Authored-By: Claude Fable 5 <noreply@anthropic.com>
Claude-Session: https://claude.ai/code/session_01UpK5k3qizhRGNuCxpEBySM
</commit_message>
<xml_diff>
--- a/extravagance/Contrato_MEDUSSSA_STUDIO_EXTRAVAGANCE_Paquete_10000.docx
+++ b/extravagance/Contrato_MEDUSSSA_STUDIO_EXTRAVAGANCE_Paquete_10000.docx
@@ -209,7 +209,7 @@
         <w:jc w:val="both"/>
       </w:pPr>
       <w:r>
-        <w:t>• Producción y publicación de diez (10) piezas de contenido para feed por cada mes de servicio: cuatro (4) videos, tres (3) publicaciones de imágenes promocionales y tres (3) plantillas de historias.</w:t>
+        <w:t>• Producción y publicación de doce (12) piezas de contenido por cada mes de servicio: siete (7) plantillas mensuales reutilizables para formatos de historia, dos (2) videos y tres (3) publicaciones en formato de carrusel.</w:t>
       </w:r>
     </w:p>
     <w:p>
@@ -219,15 +219,6 @@
       </w:pPr>
       <w:r>
         <w:t>• Realización de dos (2) sesiones mensuales de producción de fotografía y video dentro del establecimiento, destinadas a generar material audiovisual relacionado, entre otros elementos, con botellas, privados, personal, coctelería y características del lugar. Las sesiones podrán realizarse con equipo profesional, incluyendo iluminación, micrófonos y dron, sujeto a las condiciones físicas, operativas, de seguridad y de autorización existentes en el establecimiento.</w:t>
-      </w:r>
-    </w:p>
-    <w:p>
-      <w:pPr>
-        <w:ind w:firstLine="425"/>
-        <w:jc w:val="both"/>
-      </w:pPr>
-      <w:r>
-        <w:t>• Desarrollo de plantillas para historias promocionales.</w:t>
       </w:r>
     </w:p>
     <w:p>

</xml_diff>